<commit_message>
Zakończenie prac nad projektem
</commit_message>
<xml_diff>
--- a/Tic-Tac-Toe(doc).docx
+++ b/Tic-Tac-Toe(doc).docx
@@ -1,17 +1,1626 @@
 
 <file path=word/document.xml><?xml version="1.0" encoding="utf-8"?>
-<w:document xmlns:wpc="http://schemas.microsoft.com/office/word/2010/wordprocessingCanvas" xmlns:mc="http://schemas.openxmlformats.org/markup-compatibility/2006" xmlns:o="urn:schemas-microsoft-com:office:office" xmlns:r="http://schemas.openxmlformats.org/officeDocument/2006/relationships" xmlns:m="http://schemas.openxmlformats.org/officeDocument/2006/math" xmlns:v="urn:schemas-microsoft-com:vml" xmlns:wp14="http://schemas.microsoft.com/office/word/2010/wordprocessingDrawing" xmlns:wp="http://schemas.openxmlformats.org/drawingml/2006/wordprocessingDrawing" xmlns:w10="urn:schemas-microsoft-com:office:word" xmlns:w="http://schemas.openxmlformats.org/wordprocessingml/2006/main" xmlns:w14="http://schemas.microsoft.com/office/word/2010/wordml" xmlns:w15="http://schemas.microsoft.com/office/word/2012/wordml" xmlns:wpg="http://schemas.microsoft.com/office/word/2010/wordprocessingGroup" xmlns:wpi="http://schemas.microsoft.com/office/word/2010/wordprocessingInk" xmlns:wne="http://schemas.microsoft.com/office/word/2006/wordml" xmlns:wps="http://schemas.microsoft.com/office/word/2010/wordprocessingShape" xmlns:w16se="http://schemas.microsoft.com/office/word/2015/wordml/symex" xmlns:w16cid="http://schemas.microsoft.com/office/word/2016/wordml/cid" xmlns:w16="http://schemas.microsoft.com/office/word/2018/wordml" xmlns:w16cex="http://schemas.microsoft.com/office/word/2018/wordml/cex" xmlns:w16sdtdh="http://schemas.microsoft.com/office/word/2020/wordml/sdtdatahash" xmlns:w16sdtfl="http://schemas.microsoft.com/office/word/2024/wordml/sdtformatlock" mc:Ignorable="w14 w15 wp14 w16se w16cid w16 w16cex w16sdtdh w16sdtfl">
+<w:document xmlns:wpc="http://schemas.microsoft.com/office/word/2010/wordprocessingCanvas" xmlns:mc="http://schemas.openxmlformats.org/markup-compatibility/2006" xmlns:o="urn:schemas-microsoft-com:office:office" xmlns:r="http://schemas.openxmlformats.org/officeDocument/2006/relationships" xmlns:m="http://schemas.openxmlformats.org/officeDocument/2006/math" xmlns:v="urn:schemas-microsoft-com:vml" xmlns:wp14="http://schemas.microsoft.com/office/word/2010/wordprocessingDrawing" xmlns:wp="http://schemas.openxmlformats.org/drawingml/2006/wordprocessingDrawing" xmlns:w10="urn:schemas-microsoft-com:office:word" xmlns:w="http://schemas.openxmlformats.org/wordprocessingml/2006/main" xmlns:w14="http://schemas.microsoft.com/office/word/2010/wordml" xmlns:w15="http://schemas.microsoft.com/office/word/2012/wordml" xmlns:wpg="http://schemas.microsoft.com/office/word/2010/wordprocessingGroup" xmlns:wpi="http://schemas.microsoft.com/office/word/2010/wordprocessingInk" xmlns:wne="http://schemas.microsoft.com/office/word/2006/wordml" xmlns:wps="http://schemas.microsoft.com/office/word/2010/wordprocessingShape" xmlns:w16se="http://schemas.microsoft.com/office/word/2015/wordml/symex" xmlns:w16cid="http://schemas.microsoft.com/office/word/2016/wordml/cid" xmlns:w16="http://schemas.microsoft.com/office/word/2018/wordml" xmlns:w16cex="http://schemas.microsoft.com/office/word/2018/wordml/cex" xmlns:w16sdtdh="http://schemas.microsoft.com/office/word/2020/wordml/sdtdatahash" xmlns:w16sdtfl="http://schemas.microsoft.com/office/word/2024/wordml/sdtformatlock" xmlns:a="http://schemas.openxmlformats.org/drawingml/2006/main" xmlns:pic="http://schemas.openxmlformats.org/drawingml/2006/picture" xmlns:a14="http://schemas.microsoft.com/office/drawing/2010/main" mc:Ignorable="w14 w15 wp14 w16se w16cid w16 w16cex w16sdtdh w16sdtfl">
   <w:body>
     <w:p xmlns:wp14="http://schemas.microsoft.com/office/word/2010/wordml" wp14:paraId="57375426" wp14:textId="35D1A4E6">
       <w:pPr>
         <w:jc w:val="left"/>
-      </w:pPr>
-      <w:r>
-        <w:rPr>
+        <w:rPr>
+          <w:rFonts w:ascii="Bookman Old Style" w:hAnsi="Bookman Old Style" w:eastAsia="Bookman Old Style" w:cs="Bookman Old Style"/>
           <w:sz w:val="52"/>
           <w:szCs w:val="52"/>
         </w:rPr>
+      </w:pPr>
+      <w:r>
+        <w:rPr>
+          <w:rFonts w:ascii="Bookman Old Style" w:hAnsi="Bookman Old Style" w:eastAsia="Bookman Old Style" w:cs="Bookman Old Style"/>
+          <w:sz w:val="52"/>
+          <w:szCs w:val="52"/>
+        </w:rPr>
         <w:t>Start projektu: 30.08.2026r.</w:t>
+      </w:r>
+    </w:p>
+    <w:p>
+      <w:pPr>
+        <w:jc w:val="left"/>
+        <w:rPr>
+          <w:rFonts w:ascii="Batang" w:hAnsi="Batang" w:eastAsia="Batang" w:cs="Batang"/>
+          <w:sz w:val="36"/>
+          <w:szCs w:val="36"/>
+        </w:rPr>
+      </w:pPr>
+      <w:r>
+        <w:rPr>
+          <w:rFonts w:ascii="Batang" w:hAnsi="Batang" w:eastAsia="Batang" w:cs="Batang"/>
+          <w:sz w:val="36"/>
+          <w:szCs w:val="36"/>
+        </w:rPr>
+        <w:t>Stworzenie repozytorium w GitHub i utworzenie foldera projektu</w:t>
+      </w:r>
+      <w:r>
+        <w:rPr>
+          <w:rFonts w:ascii="Batang" w:hAnsi="Batang" w:eastAsia="Batang" w:cs="Batang"/>
+          <w:sz w:val="36"/>
+          <w:szCs w:val="36"/>
+        </w:rPr>
+        <w:t xml:space="preserve">. Rozpoczęcie pracy nad planszą gry. Gra to Kółko i Krzyżyk (ang. </w:t>
+      </w:r>
+      <w:r>
+        <w:rPr>
+          <w:rFonts w:ascii="Batang" w:hAnsi="Batang" w:eastAsia="Batang" w:cs="Batang"/>
+          <w:sz w:val="36"/>
+          <w:szCs w:val="36"/>
+        </w:rPr>
+        <w:t>Ti</w:t>
+      </w:r>
+      <w:r>
+        <w:rPr>
+          <w:rFonts w:ascii="Batang" w:hAnsi="Batang" w:eastAsia="Batang" w:cs="Batang"/>
+          <w:sz w:val="36"/>
+          <w:szCs w:val="36"/>
+        </w:rPr>
+        <w:t>c</w:t>
+      </w:r>
+      <w:r>
+        <w:rPr>
+          <w:rFonts w:ascii="Batang" w:hAnsi="Batang" w:eastAsia="Batang" w:cs="Batang"/>
+          <w:sz w:val="36"/>
+          <w:szCs w:val="36"/>
+        </w:rPr>
+        <w:t>-Tac-Toe). Plansza używa zer jako puste pola 3x3, a linie oddzielające to pola to hasztagi</w:t>
+      </w:r>
+      <w:r>
+        <w:rPr>
+          <w:rFonts w:ascii="Batang" w:hAnsi="Batang" w:eastAsia="Batang" w:cs="Batang"/>
+          <w:sz w:val="36"/>
+          <w:szCs w:val="36"/>
+        </w:rPr>
+        <w:t>. Linie planszy nie wychodziły poprawnie.</w:t>
+      </w:r>
+    </w:p>
+    <w:p>
+      <w:pPr>
+        <w:pStyle w:val="Normal"/>
+        <w:jc w:val="left"/>
+        <w:rPr>
+          <w:sz w:val="52"/>
+          <w:szCs w:val="52"/>
+        </w:rPr>
+      </w:pPr>
+    </w:p>
+    <w:p>
+      <w:pPr>
+        <w:pStyle w:val="Normal"/>
+        <w:jc w:val="left"/>
+      </w:pPr>
+      <w:r>
+        <w:drawing>
+          <wp:inline wp14:editId="6C3C4CDC" wp14:anchorId="6C531766">
+            <wp:extent cx="5724525" cy="3686175"/>
+            <wp:effectExtent l="0" t="0" r="0" b="0"/>
+            <wp:docPr id="1417541833" name="drawing"/>
+            <wp:cNvGraphicFramePr>
+              <a:graphicFrameLocks noChangeAspect="1"/>
+            </wp:cNvGraphicFramePr>
+            <a:graphic>
+              <a:graphicData xmlns:a="http://schemas.openxmlformats.org/drawingml/2006/main" uri="http://schemas.openxmlformats.org/drawingml/2006/picture">
+                <pic:pic xmlns:pic="http://schemas.openxmlformats.org/drawingml/2006/picture">
+                  <pic:nvPicPr>
+                    <pic:cNvPr id="1417541833" name="Picture 1417541833"/>
+                    <pic:cNvPicPr/>
+                  </pic:nvPicPr>
+                  <pic:blipFill>
+                    <a:blip xmlns:r="http://schemas.openxmlformats.org/officeDocument/2006/relationships" r:embed="rId1135646311">
+                      <a:extLst>
+                        <a:ext uri="{28A0092B-C50C-407E-A947-70E740481C1C}">
+                          <a14:useLocalDpi xmlns:a14="http://schemas.microsoft.com/office/drawing/2010/main"/>
+                        </a:ext>
+                      </a:extLst>
+                    </a:blip>
+                    <a:stretch>
+                      <a:fillRect/>
+                    </a:stretch>
+                  </pic:blipFill>
+                  <pic:spPr>
+                    <a:xfrm>
+                      <a:off x="0" y="0"/>
+                      <a:ext cx="5724525" cy="3686175"/>
+                    </a:xfrm>
+                    <a:prstGeom prst="rect">
+                      <a:avLst/>
+                    </a:prstGeom>
+                  </pic:spPr>
+                </pic:pic>
+              </a:graphicData>
+            </a:graphic>
+          </wp:inline>
+        </w:drawing>
+      </w:r>
+    </w:p>
+    <w:p>
+      <w:pPr>
+        <w:pStyle w:val="Normal"/>
+        <w:jc w:val="left"/>
+      </w:pPr>
+    </w:p>
+    <w:p>
+      <w:pPr>
+        <w:pStyle w:val="Normal"/>
+        <w:jc w:val="left"/>
+      </w:pPr>
+    </w:p>
+    <w:p>
+      <w:pPr>
+        <w:pStyle w:val="Normal"/>
+        <w:jc w:val="left"/>
+        <w:rPr>
+          <w:sz w:val="52"/>
+          <w:szCs w:val="52"/>
+        </w:rPr>
+      </w:pPr>
+    </w:p>
+    <w:p>
+      <w:pPr>
+        <w:pStyle w:val="Normal"/>
+        <w:jc w:val="left"/>
+        <w:rPr>
+          <w:rFonts w:ascii="Bookman Old Style" w:hAnsi="Bookman Old Style" w:eastAsia="Bookman Old Style" w:cs="Bookman Old Style"/>
+          <w:sz w:val="52"/>
+          <w:szCs w:val="52"/>
+        </w:rPr>
+      </w:pPr>
+      <w:r>
+        <w:rPr>
+          <w:rFonts w:ascii="Bookman Old Style" w:hAnsi="Bookman Old Style" w:eastAsia="Bookman Old Style" w:cs="Bookman Old Style"/>
+          <w:sz w:val="52"/>
+          <w:szCs w:val="52"/>
+        </w:rPr>
+        <w:t>Ukończenie planszy. Rozpoczęcie prac nad ruchami graczy i wstawianiem zmian do planszy po wykonaniu ruchu:</w:t>
+      </w:r>
+    </w:p>
+    <w:p>
+      <w:pPr>
+        <w:pStyle w:val="Normal"/>
+        <w:jc w:val="left"/>
+        <w:rPr>
+          <w:rFonts w:ascii="Bookman Old Style" w:hAnsi="Bookman Old Style" w:eastAsia="Bookman Old Style" w:cs="Bookman Old Style"/>
+          <w:sz w:val="52"/>
+          <w:szCs w:val="52"/>
+        </w:rPr>
+      </w:pPr>
+      <w:r>
+        <w:rPr>
+          <w:rFonts w:ascii="Bookman Old Style" w:hAnsi="Bookman Old Style" w:eastAsia="Bookman Old Style" w:cs="Bookman Old Style"/>
+          <w:sz w:val="52"/>
+          <w:szCs w:val="52"/>
+        </w:rPr>
+        <w:t>31.08.2026</w:t>
+      </w:r>
+      <w:r>
+        <w:rPr>
+          <w:rFonts w:ascii="Bookman Old Style" w:hAnsi="Bookman Old Style" w:eastAsia="Bookman Old Style" w:cs="Bookman Old Style"/>
+          <w:sz w:val="52"/>
+          <w:szCs w:val="52"/>
+        </w:rPr>
+        <w:t>r.</w:t>
+      </w:r>
+    </w:p>
+    <w:p>
+      <w:pPr>
+        <w:pStyle w:val="Normal"/>
+        <w:jc w:val="left"/>
+      </w:pPr>
+    </w:p>
+    <w:p>
+      <w:pPr>
+        <w:pStyle w:val="Normal"/>
+        <w:jc w:val="left"/>
+        <w:rPr>
+          <w:sz w:val="32"/>
+          <w:szCs w:val="32"/>
+        </w:rPr>
+      </w:pPr>
+      <w:r>
+        <w:rPr>
+          <w:rFonts w:ascii="Batang" w:hAnsi="Batang" w:eastAsia="Batang" w:cs="Batang"/>
+          <w:sz w:val="32"/>
+          <w:szCs w:val="32"/>
+        </w:rPr>
+        <w:t xml:space="preserve">Poprawienie </w:t>
+      </w:r>
+      <w:r>
+        <w:rPr>
+          <w:rFonts w:ascii="Batang" w:hAnsi="Batang" w:eastAsia="Batang" w:cs="Batang"/>
+          <w:sz w:val="32"/>
+          <w:szCs w:val="32"/>
+        </w:rPr>
+        <w:t>kodu</w:t>
+      </w:r>
+      <w:r>
+        <w:rPr>
+          <w:rFonts w:ascii="Batang" w:hAnsi="Batang" w:eastAsia="Batang" w:cs="Batang"/>
+          <w:sz w:val="32"/>
+          <w:szCs w:val="32"/>
+        </w:rPr>
+        <w:t xml:space="preserve"> który tworzy planszę i rozpoczęcie pisania </w:t>
+      </w:r>
+      <w:r>
+        <w:rPr>
+          <w:rFonts w:ascii="Batang" w:hAnsi="Batang" w:eastAsia="Batang" w:cs="Batang"/>
+          <w:sz w:val="32"/>
+          <w:szCs w:val="32"/>
+        </w:rPr>
+        <w:t>kodu</w:t>
+      </w:r>
+      <w:r>
+        <w:rPr>
+          <w:rFonts w:ascii="Batang" w:hAnsi="Batang" w:eastAsia="Batang" w:cs="Batang"/>
+          <w:sz w:val="32"/>
+          <w:szCs w:val="32"/>
+        </w:rPr>
+        <w:t xml:space="preserve"> który odczyta ruchy i je wpi</w:t>
+      </w:r>
+      <w:r>
+        <w:rPr>
+          <w:rFonts w:ascii="Batang" w:hAnsi="Batang" w:eastAsia="Batang" w:cs="Batang"/>
+          <w:sz w:val="32"/>
+          <w:szCs w:val="32"/>
+        </w:rPr>
+        <w:t>sze w odpowiednie pole na planszy.</w:t>
+      </w:r>
+      <w:r>
+        <w:rPr>
+          <w:rFonts w:ascii="Batang" w:hAnsi="Batang" w:eastAsia="Batang" w:cs="Batang"/>
+          <w:sz w:val="32"/>
+          <w:szCs w:val="32"/>
+        </w:rPr>
+        <w:t xml:space="preserve"> </w:t>
+      </w:r>
+      <w:r>
+        <w:rPr>
+          <w:rFonts w:ascii="Batang" w:hAnsi="Batang" w:eastAsia="Batang" w:cs="Batang"/>
+          <w:sz w:val="32"/>
+          <w:szCs w:val="32"/>
+        </w:rPr>
+        <w:t xml:space="preserve"> Wpisanie </w:t>
+      </w:r>
+      <w:r>
+        <w:rPr>
+          <w:rFonts w:ascii="Batang" w:hAnsi="Batang" w:eastAsia="Batang" w:cs="Batang"/>
+          <w:sz w:val="32"/>
+          <w:szCs w:val="32"/>
+        </w:rPr>
+        <w:t>kodu</w:t>
+      </w:r>
+      <w:r>
+        <w:rPr>
+          <w:rFonts w:ascii="Batang" w:hAnsi="Batang" w:eastAsia="Batang" w:cs="Batang"/>
+          <w:sz w:val="32"/>
+          <w:szCs w:val="32"/>
+        </w:rPr>
+        <w:t xml:space="preserve"> który tłumaczy jak poprawnie </w:t>
+      </w:r>
+      <w:r>
+        <w:rPr>
+          <w:rFonts w:ascii="Batang" w:hAnsi="Batang" w:eastAsia="Batang" w:cs="Batang"/>
+          <w:sz w:val="32"/>
+          <w:szCs w:val="32"/>
+        </w:rPr>
+        <w:t>zagrać</w:t>
+      </w:r>
+      <w:r>
+        <w:rPr>
+          <w:rFonts w:ascii="Batang" w:hAnsi="Batang" w:eastAsia="Batang" w:cs="Batang"/>
+          <w:sz w:val="32"/>
+          <w:szCs w:val="32"/>
+        </w:rPr>
+        <w:t xml:space="preserve"> aby nie było problemów z odczytem. Dodany </w:t>
+      </w:r>
+      <w:r>
+        <w:rPr>
+          <w:rFonts w:ascii="Batang" w:hAnsi="Batang" w:eastAsia="Batang" w:cs="Batang"/>
+          <w:sz w:val="32"/>
+          <w:szCs w:val="32"/>
+        </w:rPr>
+        <w:t xml:space="preserve">też był system kolejności, gdzie krzyżyk zaczyna (tak jak według reguł gry). Wpisany </w:t>
+      </w:r>
+      <w:r>
+        <w:rPr>
+          <w:rFonts w:ascii="Batang" w:hAnsi="Batang" w:eastAsia="Batang" w:cs="Batang"/>
+          <w:sz w:val="32"/>
+          <w:szCs w:val="32"/>
+        </w:rPr>
+        <w:t>tego dnia był dopiero część ruchu dla jednego pola</w:t>
+      </w:r>
+      <w:r>
+        <w:rPr>
+          <w:rFonts w:ascii="Batang" w:hAnsi="Batang" w:eastAsia="Batang" w:cs="Batang"/>
+          <w:sz w:val="32"/>
+          <w:szCs w:val="32"/>
+        </w:rPr>
+        <w:t xml:space="preserve">. Użyto </w:t>
+      </w:r>
+      <w:r>
+        <w:rPr>
+          <w:rFonts w:ascii="Batang" w:hAnsi="Batang" w:eastAsia="Batang" w:cs="Batang"/>
+          <w:sz w:val="32"/>
+          <w:szCs w:val="32"/>
+        </w:rPr>
+        <w:t>AI</w:t>
+      </w:r>
+      <w:r>
+        <w:rPr>
+          <w:rFonts w:ascii="Batang" w:hAnsi="Batang" w:eastAsia="Batang" w:cs="Batang"/>
+          <w:sz w:val="32"/>
+          <w:szCs w:val="32"/>
+        </w:rPr>
+        <w:t xml:space="preserve"> aby dowiedzieć się jaki kod może aktualizować planszę, aby pokazać każdy wykonany ruch.</w:t>
+      </w:r>
+    </w:p>
+    <w:p>
+      <w:pPr>
+        <w:pStyle w:val="Normal"/>
+        <w:jc w:val="left"/>
+      </w:pPr>
+      <w:r>
+        <w:drawing>
+          <wp:inline wp14:editId="1100973B" wp14:anchorId="1639CAB1">
+            <wp:extent cx="5724525" cy="3581400"/>
+            <wp:effectExtent l="0" t="0" r="0" b="0"/>
+            <wp:docPr id="1895010514" name="drawing"/>
+            <wp:cNvGraphicFramePr>
+              <a:graphicFrameLocks noChangeAspect="1"/>
+            </wp:cNvGraphicFramePr>
+            <a:graphic>
+              <a:graphicData xmlns:a="http://schemas.openxmlformats.org/drawingml/2006/main" uri="http://schemas.openxmlformats.org/drawingml/2006/picture">
+                <pic:pic xmlns:pic="http://schemas.openxmlformats.org/drawingml/2006/picture">
+                  <pic:nvPicPr>
+                    <pic:cNvPr id="1927857357" name="Picture 1927857357"/>
+                    <pic:cNvPicPr/>
+                  </pic:nvPicPr>
+                  <pic:blipFill>
+                    <a:blip xmlns:r="http://schemas.openxmlformats.org/officeDocument/2006/relationships" r:embed="rId1304892112">
+                      <a:extLst>
+                        <a:ext uri="{28A0092B-C50C-407E-A947-70E740481C1C}">
+                          <a14:useLocalDpi xmlns:a14="http://schemas.microsoft.com/office/drawing/2010/main"/>
+                        </a:ext>
+                      </a:extLst>
+                    </a:blip>
+                    <a:stretch>
+                      <a:fillRect/>
+                    </a:stretch>
+                  </pic:blipFill>
+                  <pic:spPr>
+                    <a:xfrm>
+                      <a:off x="0" y="0"/>
+                      <a:ext cx="5724525" cy="3581400"/>
+                    </a:xfrm>
+                    <a:prstGeom prst="rect">
+                      <a:avLst/>
+                    </a:prstGeom>
+                  </pic:spPr>
+                </pic:pic>
+              </a:graphicData>
+            </a:graphic>
+          </wp:inline>
+        </w:drawing>
+      </w:r>
+    </w:p>
+    <w:p>
+      <w:pPr>
+        <w:pStyle w:val="Normal"/>
+        <w:jc w:val="left"/>
+      </w:pPr>
+      <w:r>
+        <w:drawing>
+          <wp:inline wp14:editId="0DF74ECD" wp14:anchorId="3A8CCCAB">
+            <wp:extent cx="5724525" cy="2533650"/>
+            <wp:effectExtent l="0" t="0" r="0" b="0"/>
+            <wp:docPr id="1502816827" name="drawing"/>
+            <wp:cNvGraphicFramePr>
+              <a:graphicFrameLocks noChangeAspect="1"/>
+            </wp:cNvGraphicFramePr>
+            <a:graphic>
+              <a:graphicData xmlns:a="http://schemas.openxmlformats.org/drawingml/2006/main" uri="http://schemas.openxmlformats.org/drawingml/2006/picture">
+                <pic:pic xmlns:pic="http://schemas.openxmlformats.org/drawingml/2006/picture">
+                  <pic:nvPicPr>
+                    <pic:cNvPr id="1502816827" name="Picture 1502816827"/>
+                    <pic:cNvPicPr/>
+                  </pic:nvPicPr>
+                  <pic:blipFill>
+                    <a:blip xmlns:r="http://schemas.openxmlformats.org/officeDocument/2006/relationships" r:embed="rId1387371158">
+                      <a:extLst>
+                        <a:ext uri="{28A0092B-C50C-407E-A947-70E740481C1C}">
+                          <a14:useLocalDpi xmlns:a14="http://schemas.microsoft.com/office/drawing/2010/main"/>
+                        </a:ext>
+                      </a:extLst>
+                    </a:blip>
+                    <a:stretch>
+                      <a:fillRect/>
+                    </a:stretch>
+                  </pic:blipFill>
+                  <pic:spPr>
+                    <a:xfrm rot="0">
+                      <a:off x="0" y="0"/>
+                      <a:ext cx="5724525" cy="2533650"/>
+                    </a:xfrm>
+                    <a:prstGeom prst="rect">
+                      <a:avLst/>
+                    </a:prstGeom>
+                  </pic:spPr>
+                </pic:pic>
+              </a:graphicData>
+            </a:graphic>
+          </wp:inline>
+        </w:drawing>
+      </w:r>
+    </w:p>
+    <w:p>
+      <w:pPr>
+        <w:pStyle w:val="Normal"/>
+        <w:jc w:val="left"/>
+      </w:pPr>
+    </w:p>
+    <w:p>
+      <w:pPr>
+        <w:pStyle w:val="Normal"/>
+        <w:jc w:val="left"/>
+      </w:pPr>
+      <w:r>
+        <w:rPr>
+          <w:rFonts w:ascii="Bookman Old Style" w:hAnsi="Bookman Old Style" w:eastAsia="Bookman Old Style" w:cs="Bookman Old Style"/>
+          <w:sz w:val="52"/>
+          <w:szCs w:val="52"/>
+        </w:rPr>
+        <w:t>Ukończenie aktualizowania się planszy i stworzenie wszystkich ruchów: 01.09.2026</w:t>
+      </w:r>
+      <w:r>
+        <w:rPr>
+          <w:rFonts w:ascii="Bookman Old Style" w:hAnsi="Bookman Old Style" w:eastAsia="Bookman Old Style" w:cs="Bookman Old Style"/>
+          <w:sz w:val="52"/>
+          <w:szCs w:val="52"/>
+        </w:rPr>
+        <w:t>r.</w:t>
+      </w:r>
+    </w:p>
+    <w:p>
+      <w:pPr>
+        <w:pStyle w:val="Normal"/>
+        <w:jc w:val="left"/>
+        <w:rPr>
+          <w:rFonts w:ascii="Batang" w:hAnsi="Batang" w:eastAsia="Batang" w:cs="Batang"/>
+          <w:sz w:val="34"/>
+          <w:szCs w:val="34"/>
+        </w:rPr>
+      </w:pPr>
+      <w:r>
+        <w:rPr>
+          <w:rFonts w:ascii="Batang" w:hAnsi="Batang" w:eastAsia="Batang" w:cs="Batang"/>
+          <w:sz w:val="34"/>
+          <w:szCs w:val="34"/>
+        </w:rPr>
+        <w:t>Wpisano resztę kodu dla poprzedniego pola (Centre/Środek) i napisano kod dla wszystkich innych</w:t>
+      </w:r>
+      <w:r>
+        <w:rPr>
+          <w:rFonts w:ascii="Batang" w:hAnsi="Batang" w:eastAsia="Batang" w:cs="Batang"/>
+          <w:sz w:val="34"/>
+          <w:szCs w:val="34"/>
+        </w:rPr>
+        <w:t xml:space="preserve"> </w:t>
+      </w:r>
+      <w:r>
+        <w:rPr>
+          <w:rFonts w:ascii="Batang" w:hAnsi="Batang" w:eastAsia="Batang" w:cs="Batang"/>
+          <w:sz w:val="34"/>
+          <w:szCs w:val="34"/>
+        </w:rPr>
+        <w:t>pól.</w:t>
+      </w:r>
+    </w:p>
+    <w:p>
+      <w:pPr>
+        <w:pStyle w:val="Normal"/>
+        <w:jc w:val="left"/>
+        <w:rPr>
+          <w:rFonts w:ascii="Batang" w:hAnsi="Batang" w:eastAsia="Batang" w:cs="Batang"/>
+          <w:sz w:val="34"/>
+          <w:szCs w:val="34"/>
+          <w:lang w:val="en-US"/>
+        </w:rPr>
+      </w:pPr>
+      <w:r>
+        <w:rPr>
+          <w:rFonts w:ascii="Batang" w:hAnsi="Batang" w:eastAsia="Batang" w:cs="Batang"/>
+          <w:sz w:val="34"/>
+          <w:szCs w:val="34"/>
+          <w:lang w:val="en-US"/>
+        </w:rPr>
+        <w:t>Nazwy</w:t>
+      </w:r>
+      <w:r>
+        <w:rPr>
+          <w:rFonts w:ascii="Batang" w:hAnsi="Batang" w:eastAsia="Batang" w:cs="Batang"/>
+          <w:sz w:val="34"/>
+          <w:szCs w:val="34"/>
+          <w:lang w:val="en-US"/>
+        </w:rPr>
+        <w:t xml:space="preserve"> </w:t>
+      </w:r>
+      <w:r>
+        <w:rPr>
+          <w:rFonts w:ascii="Batang" w:hAnsi="Batang" w:eastAsia="Batang" w:cs="Batang"/>
+          <w:sz w:val="34"/>
+          <w:szCs w:val="34"/>
+          <w:lang w:val="en-US"/>
+        </w:rPr>
+        <w:t>pól</w:t>
+      </w:r>
+      <w:r>
+        <w:rPr>
+          <w:rFonts w:ascii="Batang" w:hAnsi="Batang" w:eastAsia="Batang" w:cs="Batang"/>
+          <w:sz w:val="34"/>
+          <w:szCs w:val="34"/>
+          <w:lang w:val="en-US"/>
+        </w:rPr>
+        <w:t xml:space="preserve"> to: Centre/</w:t>
+      </w:r>
+      <w:r>
+        <w:rPr>
+          <w:rFonts w:ascii="Batang" w:hAnsi="Batang" w:eastAsia="Batang" w:cs="Batang"/>
+          <w:sz w:val="34"/>
+          <w:szCs w:val="34"/>
+          <w:lang w:val="en-US"/>
+        </w:rPr>
+        <w:t>Środek</w:t>
+      </w:r>
+      <w:r>
+        <w:rPr>
+          <w:rFonts w:ascii="Batang" w:hAnsi="Batang" w:eastAsia="Batang" w:cs="Batang"/>
+          <w:sz w:val="34"/>
+          <w:szCs w:val="34"/>
+          <w:lang w:val="en-US"/>
+        </w:rPr>
+        <w:t xml:space="preserve"> </w:t>
+      </w:r>
+      <w:r>
+        <w:rPr>
+          <w:rFonts w:ascii="Batang" w:hAnsi="Batang" w:eastAsia="Batang" w:cs="Batang"/>
+          <w:sz w:val="34"/>
+          <w:szCs w:val="34"/>
+          <w:lang w:val="en-US"/>
+        </w:rPr>
+        <w:t>|</w:t>
+      </w:r>
+      <w:r>
+        <w:rPr>
+          <w:rFonts w:ascii="Batang" w:hAnsi="Batang" w:eastAsia="Batang" w:cs="Batang"/>
+          <w:sz w:val="34"/>
+          <w:szCs w:val="34"/>
+          <w:lang w:val="en-US"/>
+        </w:rPr>
+        <w:t xml:space="preserve"> Left/</w:t>
+      </w:r>
+      <w:r>
+        <w:rPr>
+          <w:rFonts w:ascii="Batang" w:hAnsi="Batang" w:eastAsia="Batang" w:cs="Batang"/>
+          <w:sz w:val="34"/>
+          <w:szCs w:val="34"/>
+          <w:lang w:val="en-US"/>
+        </w:rPr>
+        <w:t>Lewo</w:t>
+      </w:r>
+      <w:r>
+        <w:rPr>
+          <w:rFonts w:ascii="Batang" w:hAnsi="Batang" w:eastAsia="Batang" w:cs="Batang"/>
+          <w:sz w:val="34"/>
+          <w:szCs w:val="34"/>
+          <w:lang w:val="en-US"/>
+        </w:rPr>
+        <w:t xml:space="preserve"> </w:t>
+      </w:r>
+      <w:r>
+        <w:rPr>
+          <w:rFonts w:ascii="Batang" w:hAnsi="Batang" w:eastAsia="Batang" w:cs="Batang"/>
+          <w:sz w:val="34"/>
+          <w:szCs w:val="34"/>
+          <w:lang w:val="en-US"/>
+        </w:rPr>
+        <w:t>|</w:t>
+      </w:r>
+      <w:r>
+        <w:rPr>
+          <w:rFonts w:ascii="Batang" w:hAnsi="Batang" w:eastAsia="Batang" w:cs="Batang"/>
+          <w:sz w:val="34"/>
+          <w:szCs w:val="34"/>
+          <w:lang w:val="en-US"/>
+        </w:rPr>
+        <w:t xml:space="preserve"> Right/</w:t>
+      </w:r>
+      <w:r>
+        <w:rPr>
+          <w:rFonts w:ascii="Batang" w:hAnsi="Batang" w:eastAsia="Batang" w:cs="Batang"/>
+          <w:sz w:val="34"/>
+          <w:szCs w:val="34"/>
+          <w:lang w:val="en-US"/>
+        </w:rPr>
+        <w:t>Prawo</w:t>
+      </w:r>
+      <w:r>
+        <w:rPr>
+          <w:rFonts w:ascii="Batang" w:hAnsi="Batang" w:eastAsia="Batang" w:cs="Batang"/>
+          <w:sz w:val="34"/>
+          <w:szCs w:val="34"/>
+          <w:lang w:val="en-US"/>
+        </w:rPr>
+        <w:t xml:space="preserve">  Top/Góra </w:t>
+      </w:r>
+      <w:r>
+        <w:rPr>
+          <w:rFonts w:ascii="Batang" w:hAnsi="Batang" w:eastAsia="Batang" w:cs="Batang"/>
+          <w:sz w:val="34"/>
+          <w:szCs w:val="34"/>
+          <w:lang w:val="en-US"/>
+        </w:rPr>
+        <w:t>|</w:t>
+      </w:r>
+      <w:r>
+        <w:rPr>
+          <w:rFonts w:ascii="Batang" w:hAnsi="Batang" w:eastAsia="Batang" w:cs="Batang"/>
+          <w:sz w:val="34"/>
+          <w:szCs w:val="34"/>
+          <w:lang w:val="en-US"/>
+        </w:rPr>
+        <w:t xml:space="preserve"> </w:t>
+      </w:r>
+      <w:r>
+        <w:rPr>
+          <w:rFonts w:ascii="Batang" w:hAnsi="Batang" w:eastAsia="Batang" w:cs="Batang"/>
+          <w:sz w:val="34"/>
+          <w:szCs w:val="34"/>
+          <w:lang w:val="en-US"/>
+        </w:rPr>
+        <w:t>TopLeft</w:t>
+      </w:r>
+      <w:r>
+        <w:rPr>
+          <w:rFonts w:ascii="Batang" w:hAnsi="Batang" w:eastAsia="Batang" w:cs="Batang"/>
+          <w:sz w:val="34"/>
+          <w:szCs w:val="34"/>
+          <w:lang w:val="en-US"/>
+        </w:rPr>
+        <w:t>/</w:t>
+      </w:r>
+      <w:r>
+        <w:rPr>
+          <w:rFonts w:ascii="Batang" w:hAnsi="Batang" w:eastAsia="Batang" w:cs="Batang"/>
+          <w:sz w:val="34"/>
+          <w:szCs w:val="34"/>
+          <w:lang w:val="en-US"/>
+        </w:rPr>
+        <w:t>LewaGó</w:t>
+      </w:r>
+      <w:r>
+        <w:rPr>
+          <w:rFonts w:ascii="Batang" w:hAnsi="Batang" w:eastAsia="Batang" w:cs="Batang"/>
+          <w:sz w:val="34"/>
+          <w:szCs w:val="34"/>
+          <w:lang w:val="en-US"/>
+        </w:rPr>
+        <w:t>ra</w:t>
+      </w:r>
+      <w:r>
+        <w:rPr>
+          <w:rFonts w:ascii="Batang" w:hAnsi="Batang" w:eastAsia="Batang" w:cs="Batang"/>
+          <w:sz w:val="34"/>
+          <w:szCs w:val="34"/>
+          <w:lang w:val="en-US"/>
+        </w:rPr>
+        <w:t xml:space="preserve"> </w:t>
+      </w:r>
+      <w:r>
+        <w:rPr>
+          <w:rFonts w:ascii="Batang" w:hAnsi="Batang" w:eastAsia="Batang" w:cs="Batang"/>
+          <w:sz w:val="34"/>
+          <w:szCs w:val="34"/>
+          <w:lang w:val="en-US"/>
+        </w:rPr>
+        <w:t>|</w:t>
+      </w:r>
+      <w:r>
+        <w:rPr>
+          <w:rFonts w:ascii="Batang" w:hAnsi="Batang" w:eastAsia="Batang" w:cs="Batang"/>
+          <w:sz w:val="34"/>
+          <w:szCs w:val="34"/>
+          <w:lang w:val="en-US"/>
+        </w:rPr>
+        <w:t xml:space="preserve"> </w:t>
+      </w:r>
+      <w:r>
+        <w:rPr>
+          <w:rFonts w:ascii="Batang" w:hAnsi="Batang" w:eastAsia="Batang" w:cs="Batang"/>
+          <w:sz w:val="34"/>
+          <w:szCs w:val="34"/>
+          <w:lang w:val="en-US"/>
+        </w:rPr>
+        <w:t>TopRight</w:t>
+      </w:r>
+      <w:r>
+        <w:rPr>
+          <w:rFonts w:ascii="Batang" w:hAnsi="Batang" w:eastAsia="Batang" w:cs="Batang"/>
+          <w:sz w:val="34"/>
+          <w:szCs w:val="34"/>
+          <w:lang w:val="en-US"/>
+        </w:rPr>
+        <w:t>/</w:t>
+      </w:r>
+      <w:r>
+        <w:rPr>
+          <w:rFonts w:ascii="Batang" w:hAnsi="Batang" w:eastAsia="Batang" w:cs="Batang"/>
+          <w:sz w:val="34"/>
+          <w:szCs w:val="34"/>
+          <w:lang w:val="en-US"/>
+        </w:rPr>
+        <w:t>PrawaGóra</w:t>
+      </w:r>
+      <w:r>
+        <w:rPr>
+          <w:rFonts w:ascii="Batang" w:hAnsi="Batang" w:eastAsia="Batang" w:cs="Batang"/>
+          <w:sz w:val="34"/>
+          <w:szCs w:val="34"/>
+          <w:lang w:val="en-US"/>
+        </w:rPr>
+        <w:t xml:space="preserve">  Bottom/</w:t>
+      </w:r>
+      <w:r>
+        <w:rPr>
+          <w:rFonts w:ascii="Batang" w:hAnsi="Batang" w:eastAsia="Batang" w:cs="Batang"/>
+          <w:sz w:val="34"/>
+          <w:szCs w:val="34"/>
+          <w:lang w:val="en-US"/>
+        </w:rPr>
+        <w:t>Dół</w:t>
+      </w:r>
+      <w:r>
+        <w:rPr>
+          <w:rFonts w:ascii="Batang" w:hAnsi="Batang" w:eastAsia="Batang" w:cs="Batang"/>
+          <w:sz w:val="34"/>
+          <w:szCs w:val="34"/>
+          <w:lang w:val="en-US"/>
+        </w:rPr>
+        <w:t xml:space="preserve"> </w:t>
+      </w:r>
+      <w:r>
+        <w:rPr>
+          <w:rFonts w:ascii="Batang" w:hAnsi="Batang" w:eastAsia="Batang" w:cs="Batang"/>
+          <w:sz w:val="34"/>
+          <w:szCs w:val="34"/>
+          <w:lang w:val="en-US"/>
+        </w:rPr>
+        <w:t>|</w:t>
+      </w:r>
+      <w:r>
+        <w:rPr>
+          <w:rFonts w:ascii="Batang" w:hAnsi="Batang" w:eastAsia="Batang" w:cs="Batang"/>
+          <w:sz w:val="34"/>
+          <w:szCs w:val="34"/>
+          <w:lang w:val="en-US"/>
+        </w:rPr>
+        <w:t xml:space="preserve"> </w:t>
+      </w:r>
+      <w:r>
+        <w:rPr>
+          <w:rFonts w:ascii="Batang" w:hAnsi="Batang" w:eastAsia="Batang" w:cs="Batang"/>
+          <w:sz w:val="34"/>
+          <w:szCs w:val="34"/>
+          <w:lang w:val="en-US"/>
+        </w:rPr>
+        <w:t>BottomLeft</w:t>
+      </w:r>
+      <w:r>
+        <w:rPr>
+          <w:rFonts w:ascii="Batang" w:hAnsi="Batang" w:eastAsia="Batang" w:cs="Batang"/>
+          <w:sz w:val="34"/>
+          <w:szCs w:val="34"/>
+          <w:lang w:val="en-US"/>
+        </w:rPr>
+        <w:t>/</w:t>
+      </w:r>
+      <w:r>
+        <w:rPr>
+          <w:rFonts w:ascii="Batang" w:hAnsi="Batang" w:eastAsia="Batang" w:cs="Batang"/>
+          <w:sz w:val="34"/>
+          <w:szCs w:val="34"/>
+          <w:lang w:val="en-US"/>
+        </w:rPr>
+        <w:t>LewyDół</w:t>
+      </w:r>
+      <w:r>
+        <w:rPr>
+          <w:rFonts w:ascii="Batang" w:hAnsi="Batang" w:eastAsia="Batang" w:cs="Batang"/>
+          <w:sz w:val="34"/>
+          <w:szCs w:val="34"/>
+          <w:lang w:val="en-US"/>
+        </w:rPr>
+        <w:t xml:space="preserve"> </w:t>
+      </w:r>
+      <w:r>
+        <w:rPr>
+          <w:rFonts w:ascii="Batang" w:hAnsi="Batang" w:eastAsia="Batang" w:cs="Batang"/>
+          <w:sz w:val="34"/>
+          <w:szCs w:val="34"/>
+          <w:lang w:val="en-US"/>
+        </w:rPr>
+        <w:t>|</w:t>
+      </w:r>
+      <w:r>
+        <w:rPr>
+          <w:rFonts w:ascii="Batang" w:hAnsi="Batang" w:eastAsia="Batang" w:cs="Batang"/>
+          <w:sz w:val="34"/>
+          <w:szCs w:val="34"/>
+          <w:lang w:val="en-US"/>
+        </w:rPr>
+        <w:t xml:space="preserve"> </w:t>
+      </w:r>
+      <w:r>
+        <w:rPr>
+          <w:rFonts w:ascii="Batang" w:hAnsi="Batang" w:eastAsia="Batang" w:cs="Batang"/>
+          <w:sz w:val="34"/>
+          <w:szCs w:val="34"/>
+          <w:lang w:val="en-US"/>
+        </w:rPr>
+        <w:t>BottomRight</w:t>
+      </w:r>
+      <w:r>
+        <w:rPr>
+          <w:rFonts w:ascii="Batang" w:hAnsi="Batang" w:eastAsia="Batang" w:cs="Batang"/>
+          <w:sz w:val="34"/>
+          <w:szCs w:val="34"/>
+          <w:lang w:val="en-US"/>
+        </w:rPr>
+        <w:t>/</w:t>
+      </w:r>
+      <w:r>
+        <w:rPr>
+          <w:rFonts w:ascii="Batang" w:hAnsi="Batang" w:eastAsia="Batang" w:cs="Batang"/>
+          <w:sz w:val="34"/>
+          <w:szCs w:val="34"/>
+          <w:lang w:val="en-US"/>
+        </w:rPr>
+        <w:t>PrawyDół</w:t>
+      </w:r>
+      <w:r>
+        <w:rPr>
+          <w:rFonts w:ascii="Batang" w:hAnsi="Batang" w:eastAsia="Batang" w:cs="Batang"/>
+          <w:sz w:val="34"/>
+          <w:szCs w:val="34"/>
+          <w:lang w:val="en-US"/>
+        </w:rPr>
+        <w:t>.</w:t>
+      </w:r>
+    </w:p>
+    <w:p>
+      <w:pPr>
+        <w:pStyle w:val="Normal"/>
+        <w:jc w:val="left"/>
+      </w:pPr>
+      <w:r>
+        <w:rPr>
+          <w:rFonts w:ascii="Batang" w:hAnsi="Batang" w:eastAsia="Batang" w:cs="Batang"/>
+          <w:sz w:val="34"/>
+          <w:szCs w:val="34"/>
+          <w:lang w:val="en-US"/>
+        </w:rPr>
+        <w:t>Dodano</w:t>
+      </w:r>
+      <w:r>
+        <w:rPr>
+          <w:rFonts w:ascii="Batang" w:hAnsi="Batang" w:eastAsia="Batang" w:cs="Batang"/>
+          <w:sz w:val="34"/>
+          <w:szCs w:val="34"/>
+          <w:lang w:val="en-US"/>
+        </w:rPr>
+        <w:t xml:space="preserve"> </w:t>
+      </w:r>
+      <w:r>
+        <w:rPr>
+          <w:rFonts w:ascii="Batang" w:hAnsi="Batang" w:eastAsia="Batang" w:cs="Batang"/>
+          <w:sz w:val="34"/>
+          <w:szCs w:val="34"/>
+          <w:lang w:val="en-US"/>
+        </w:rPr>
+        <w:t>kod</w:t>
+      </w:r>
+      <w:r>
+        <w:rPr>
+          <w:rFonts w:ascii="Batang" w:hAnsi="Batang" w:eastAsia="Batang" w:cs="Batang"/>
+          <w:sz w:val="34"/>
+          <w:szCs w:val="34"/>
+          <w:lang w:val="en-US"/>
+        </w:rPr>
+        <w:t xml:space="preserve">, </w:t>
+      </w:r>
+      <w:r>
+        <w:rPr>
+          <w:rFonts w:ascii="Batang" w:hAnsi="Batang" w:eastAsia="Batang" w:cs="Batang"/>
+          <w:sz w:val="34"/>
+          <w:szCs w:val="34"/>
+          <w:lang w:val="en-US"/>
+        </w:rPr>
+        <w:t>który</w:t>
+      </w:r>
+      <w:r>
+        <w:rPr>
+          <w:rFonts w:ascii="Batang" w:hAnsi="Batang" w:eastAsia="Batang" w:cs="Batang"/>
+          <w:sz w:val="34"/>
+          <w:szCs w:val="34"/>
+          <w:lang w:val="en-US"/>
+        </w:rPr>
+        <w:t xml:space="preserve"> </w:t>
+      </w:r>
+      <w:r>
+        <w:rPr>
+          <w:rFonts w:ascii="Batang" w:hAnsi="Batang" w:eastAsia="Batang" w:cs="Batang"/>
+          <w:sz w:val="34"/>
+          <w:szCs w:val="34"/>
+          <w:lang w:val="en-US"/>
+        </w:rPr>
+        <w:t>kiedy</w:t>
+      </w:r>
+      <w:r>
+        <w:rPr>
+          <w:rFonts w:ascii="Batang" w:hAnsi="Batang" w:eastAsia="Batang" w:cs="Batang"/>
+          <w:sz w:val="34"/>
+          <w:szCs w:val="34"/>
+          <w:lang w:val="en-US"/>
+        </w:rPr>
+        <w:t xml:space="preserve"> </w:t>
+      </w:r>
+      <w:r>
+        <w:rPr>
+          <w:rFonts w:ascii="Batang" w:hAnsi="Batang" w:eastAsia="Batang" w:cs="Batang"/>
+          <w:sz w:val="34"/>
+          <w:szCs w:val="34"/>
+          <w:lang w:val="en-US"/>
+        </w:rPr>
+        <w:t>się</w:t>
+      </w:r>
+      <w:r>
+        <w:rPr>
+          <w:rFonts w:ascii="Batang" w:hAnsi="Batang" w:eastAsia="Batang" w:cs="Batang"/>
+          <w:sz w:val="34"/>
+          <w:szCs w:val="34"/>
+          <w:lang w:val="en-US"/>
+        </w:rPr>
+        <w:t xml:space="preserve"> </w:t>
+      </w:r>
+      <w:r>
+        <w:rPr>
+          <w:rFonts w:ascii="Batang" w:hAnsi="Batang" w:eastAsia="Batang" w:cs="Batang"/>
+          <w:sz w:val="34"/>
+          <w:szCs w:val="34"/>
+          <w:lang w:val="en-US"/>
+        </w:rPr>
+        <w:t>wpisze</w:t>
+      </w:r>
+      <w:r>
+        <w:rPr>
+          <w:rFonts w:ascii="Batang" w:hAnsi="Batang" w:eastAsia="Batang" w:cs="Batang"/>
+          <w:sz w:val="34"/>
+          <w:szCs w:val="34"/>
+          <w:lang w:val="en-US"/>
+        </w:rPr>
+        <w:t xml:space="preserve"> pole, </w:t>
+      </w:r>
+      <w:r>
+        <w:rPr>
+          <w:rFonts w:ascii="Batang" w:hAnsi="Batang" w:eastAsia="Batang" w:cs="Batang"/>
+          <w:sz w:val="34"/>
+          <w:szCs w:val="34"/>
+          <w:lang w:val="en-US"/>
+        </w:rPr>
+        <w:t>które</w:t>
+      </w:r>
+      <w:r>
+        <w:rPr>
+          <w:rFonts w:ascii="Batang" w:hAnsi="Batang" w:eastAsia="Batang" w:cs="Batang"/>
+          <w:sz w:val="34"/>
+          <w:szCs w:val="34"/>
+          <w:lang w:val="en-US"/>
+        </w:rPr>
+        <w:t xml:space="preserve"> jest </w:t>
+      </w:r>
+      <w:r>
+        <w:rPr>
+          <w:rFonts w:ascii="Batang" w:hAnsi="Batang" w:eastAsia="Batang" w:cs="Batang"/>
+          <w:sz w:val="34"/>
+          <w:szCs w:val="34"/>
+          <w:lang w:val="en-US"/>
+        </w:rPr>
+        <w:t>już</w:t>
+      </w:r>
+      <w:r>
+        <w:rPr>
+          <w:rFonts w:ascii="Batang" w:hAnsi="Batang" w:eastAsia="Batang" w:cs="Batang"/>
+          <w:sz w:val="34"/>
+          <w:szCs w:val="34"/>
+          <w:lang w:val="en-US"/>
+        </w:rPr>
+        <w:t xml:space="preserve"> </w:t>
+      </w:r>
+      <w:r>
+        <w:rPr>
+          <w:rFonts w:ascii="Batang" w:hAnsi="Batang" w:eastAsia="Batang" w:cs="Batang"/>
+          <w:sz w:val="34"/>
+          <w:szCs w:val="34"/>
+          <w:lang w:val="en-US"/>
+        </w:rPr>
+        <w:t>za</w:t>
+      </w:r>
+      <w:r>
+        <w:rPr>
+          <w:rFonts w:ascii="Batang" w:hAnsi="Batang" w:eastAsia="Batang" w:cs="Batang"/>
+          <w:sz w:val="34"/>
+          <w:szCs w:val="34"/>
+          <w:lang w:val="en-US"/>
+        </w:rPr>
+        <w:t>jęte</w:t>
+      </w:r>
+      <w:r>
+        <w:rPr>
+          <w:rFonts w:ascii="Batang" w:hAnsi="Batang" w:eastAsia="Batang" w:cs="Batang"/>
+          <w:sz w:val="34"/>
+          <w:szCs w:val="34"/>
+          <w:lang w:val="en-US"/>
+        </w:rPr>
+        <w:t xml:space="preserve">, </w:t>
+      </w:r>
+      <w:r>
+        <w:rPr>
+          <w:rFonts w:ascii="Batang" w:hAnsi="Batang" w:eastAsia="Batang" w:cs="Batang"/>
+          <w:sz w:val="34"/>
+          <w:szCs w:val="34"/>
+          <w:lang w:val="en-US"/>
+        </w:rPr>
+        <w:t>wypisze</w:t>
+      </w:r>
+      <w:r>
+        <w:rPr>
+          <w:rFonts w:ascii="Batang" w:hAnsi="Batang" w:eastAsia="Batang" w:cs="Batang"/>
+          <w:sz w:val="34"/>
+          <w:szCs w:val="34"/>
+          <w:lang w:val="en-US"/>
+        </w:rPr>
+        <w:t xml:space="preserve"> </w:t>
+      </w:r>
+      <w:r>
+        <w:rPr>
+          <w:rFonts w:ascii="Batang" w:hAnsi="Batang" w:eastAsia="Batang" w:cs="Batang"/>
+          <w:sz w:val="34"/>
+          <w:szCs w:val="34"/>
+          <w:lang w:val="en-US"/>
+        </w:rPr>
+        <w:t>komunikat</w:t>
+      </w:r>
+      <w:r>
+        <w:rPr>
+          <w:rFonts w:ascii="Batang" w:hAnsi="Batang" w:eastAsia="Batang" w:cs="Batang"/>
+          <w:sz w:val="34"/>
+          <w:szCs w:val="34"/>
+          <w:lang w:val="en-US"/>
+        </w:rPr>
+        <w:t xml:space="preserve"> o </w:t>
+      </w:r>
+      <w:r>
+        <w:rPr>
+          <w:rFonts w:ascii="Batang" w:hAnsi="Batang" w:eastAsia="Batang" w:cs="Batang"/>
+          <w:sz w:val="34"/>
+          <w:szCs w:val="34"/>
+          <w:lang w:val="en-US"/>
+        </w:rPr>
+        <w:t>sytuacji</w:t>
+      </w:r>
+      <w:r>
+        <w:rPr>
+          <w:rFonts w:ascii="Batang" w:hAnsi="Batang" w:eastAsia="Batang" w:cs="Batang"/>
+          <w:sz w:val="34"/>
+          <w:szCs w:val="34"/>
+          <w:lang w:val="en-US"/>
+        </w:rPr>
+        <w:t xml:space="preserve"> </w:t>
+      </w:r>
+      <w:r>
+        <w:rPr>
+          <w:rFonts w:ascii="Batang" w:hAnsi="Batang" w:eastAsia="Batang" w:cs="Batang"/>
+          <w:sz w:val="34"/>
+          <w:szCs w:val="34"/>
+          <w:lang w:val="en-US"/>
+        </w:rPr>
+        <w:t>i</w:t>
+      </w:r>
+      <w:r>
+        <w:rPr>
+          <w:rFonts w:ascii="Batang" w:hAnsi="Batang" w:eastAsia="Batang" w:cs="Batang"/>
+          <w:sz w:val="34"/>
+          <w:szCs w:val="34"/>
+          <w:lang w:val="en-US"/>
+        </w:rPr>
+        <w:t xml:space="preserve"> </w:t>
+      </w:r>
+      <w:r>
+        <w:rPr>
+          <w:rFonts w:ascii="Batang" w:hAnsi="Batang" w:eastAsia="Batang" w:cs="Batang"/>
+          <w:sz w:val="34"/>
+          <w:szCs w:val="34"/>
+          <w:lang w:val="en-US"/>
+        </w:rPr>
+        <w:t>powtórzy</w:t>
+      </w:r>
+      <w:r>
+        <w:rPr>
+          <w:rFonts w:ascii="Batang" w:hAnsi="Batang" w:eastAsia="Batang" w:cs="Batang"/>
+          <w:sz w:val="34"/>
+          <w:szCs w:val="34"/>
+          <w:lang w:val="en-US"/>
+        </w:rPr>
+        <w:t xml:space="preserve"> </w:t>
+      </w:r>
+      <w:r>
+        <w:rPr>
+          <w:rFonts w:ascii="Batang" w:hAnsi="Batang" w:eastAsia="Batang" w:cs="Batang"/>
+          <w:sz w:val="34"/>
+          <w:szCs w:val="34"/>
+          <w:lang w:val="en-US"/>
+        </w:rPr>
+        <w:t>kolej</w:t>
+      </w:r>
+      <w:r>
+        <w:rPr>
+          <w:rFonts w:ascii="Batang" w:hAnsi="Batang" w:eastAsia="Batang" w:cs="Batang"/>
+          <w:sz w:val="34"/>
+          <w:szCs w:val="34"/>
+          <w:lang w:val="en-US"/>
+        </w:rPr>
+        <w:t xml:space="preserve"> </w:t>
+      </w:r>
+      <w:r>
+        <w:rPr>
+          <w:rFonts w:ascii="Batang" w:hAnsi="Batang" w:eastAsia="Batang" w:cs="Batang"/>
+          <w:sz w:val="34"/>
+          <w:szCs w:val="34"/>
+          <w:lang w:val="en-US"/>
+        </w:rPr>
+        <w:t>gracza,a</w:t>
+      </w:r>
+      <w:r>
+        <w:rPr>
+          <w:rFonts w:ascii="Batang" w:hAnsi="Batang" w:eastAsia="Batang" w:cs="Batang"/>
+          <w:sz w:val="34"/>
+          <w:szCs w:val="34"/>
+          <w:lang w:val="en-US"/>
+        </w:rPr>
+        <w:t xml:space="preserve"> </w:t>
+      </w:r>
+      <w:r>
+        <w:rPr>
+          <w:rFonts w:ascii="Batang" w:hAnsi="Batang" w:eastAsia="Batang" w:cs="Batang"/>
+          <w:sz w:val="34"/>
+          <w:szCs w:val="34"/>
+          <w:lang w:val="en-US"/>
+        </w:rPr>
+        <w:t>kiedy</w:t>
+      </w:r>
+      <w:r>
+        <w:rPr>
+          <w:rFonts w:ascii="Batang" w:hAnsi="Batang" w:eastAsia="Batang" w:cs="Batang"/>
+          <w:sz w:val="34"/>
+          <w:szCs w:val="34"/>
+          <w:lang w:val="en-US"/>
+        </w:rPr>
+        <w:t xml:space="preserve"> </w:t>
+      </w:r>
+      <w:r>
+        <w:rPr>
+          <w:rFonts w:ascii="Batang" w:hAnsi="Batang" w:eastAsia="Batang" w:cs="Batang"/>
+          <w:sz w:val="34"/>
+          <w:szCs w:val="34"/>
+          <w:lang w:val="en-US"/>
+        </w:rPr>
+        <w:t>ruch</w:t>
+      </w:r>
+      <w:r>
+        <w:rPr>
+          <w:rFonts w:ascii="Batang" w:hAnsi="Batang" w:eastAsia="Batang" w:cs="Batang"/>
+          <w:sz w:val="34"/>
+          <w:szCs w:val="34"/>
+          <w:lang w:val="en-US"/>
+        </w:rPr>
+        <w:t xml:space="preserve"> </w:t>
+      </w:r>
+      <w:r>
+        <w:rPr>
+          <w:rFonts w:ascii="Batang" w:hAnsi="Batang" w:eastAsia="Batang" w:cs="Batang"/>
+          <w:sz w:val="34"/>
+          <w:szCs w:val="34"/>
+          <w:lang w:val="en-US"/>
+        </w:rPr>
+        <w:t>będzie</w:t>
+      </w:r>
+      <w:r>
+        <w:rPr>
+          <w:rFonts w:ascii="Batang" w:hAnsi="Batang" w:eastAsia="Batang" w:cs="Batang"/>
+          <w:sz w:val="34"/>
+          <w:szCs w:val="34"/>
+          <w:lang w:val="en-US"/>
+        </w:rPr>
+        <w:t xml:space="preserve"> </w:t>
+      </w:r>
+      <w:r>
+        <w:rPr>
+          <w:rFonts w:ascii="Batang" w:hAnsi="Batang" w:eastAsia="Batang" w:cs="Batang"/>
+          <w:sz w:val="34"/>
+          <w:szCs w:val="34"/>
+          <w:lang w:val="en-US"/>
+        </w:rPr>
+        <w:t>poprawny</w:t>
+      </w:r>
+      <w:r>
+        <w:rPr>
+          <w:rFonts w:ascii="Batang" w:hAnsi="Batang" w:eastAsia="Batang" w:cs="Batang"/>
+          <w:sz w:val="34"/>
+          <w:szCs w:val="34"/>
+          <w:lang w:val="en-US"/>
+        </w:rPr>
+        <w:t xml:space="preserve"> </w:t>
+      </w:r>
+      <w:r>
+        <w:rPr>
+          <w:rFonts w:ascii="Batang" w:hAnsi="Batang" w:eastAsia="Batang" w:cs="Batang"/>
+          <w:sz w:val="34"/>
+          <w:szCs w:val="34"/>
+          <w:lang w:val="en-US"/>
+        </w:rPr>
+        <w:t>komunikat</w:t>
+      </w:r>
+      <w:r>
+        <w:rPr>
+          <w:rFonts w:ascii="Batang" w:hAnsi="Batang" w:eastAsia="Batang" w:cs="Batang"/>
+          <w:sz w:val="34"/>
+          <w:szCs w:val="34"/>
+          <w:lang w:val="en-US"/>
+        </w:rPr>
+        <w:t xml:space="preserve"> znika.</w:t>
+      </w:r>
+    </w:p>
+    <w:p>
+      <w:pPr>
+        <w:pStyle w:val="Normal"/>
+        <w:jc w:val="left"/>
+        <w:rPr>
+          <w:sz w:val="36"/>
+          <w:szCs w:val="36"/>
+        </w:rPr>
+      </w:pPr>
+    </w:p>
+    <w:p>
+      <w:pPr>
+        <w:pStyle w:val="Normal"/>
+        <w:jc w:val="left"/>
+      </w:pPr>
+    </w:p>
+    <w:p>
+      <w:pPr>
+        <w:pStyle w:val="Normal"/>
+        <w:jc w:val="left"/>
+      </w:pPr>
+    </w:p>
+    <w:p>
+      <w:pPr>
+        <w:pStyle w:val="Normal"/>
+        <w:jc w:val="left"/>
+      </w:pPr>
+    </w:p>
+    <w:p>
+      <w:pPr>
+        <w:pStyle w:val="Normal"/>
+        <w:jc w:val="left"/>
+      </w:pPr>
+    </w:p>
+    <w:p>
+      <w:pPr>
+        <w:pStyle w:val="Normal"/>
+        <w:jc w:val="left"/>
+      </w:pPr>
+    </w:p>
+    <w:p>
+      <w:pPr>
+        <w:pStyle w:val="Normal"/>
+        <w:jc w:val="left"/>
+      </w:pPr>
+      <w:r>
+        <w:drawing>
+          <wp:inline wp14:editId="05614079" wp14:anchorId="0A5576A9">
+            <wp:extent cx="5734050" cy="3181350"/>
+            <wp:effectExtent l="0" t="0" r="0" b="0"/>
+            <wp:docPr id="691994830" name="drawing"/>
+            <wp:cNvGraphicFramePr>
+              <a:graphicFrameLocks noChangeAspect="1"/>
+            </wp:cNvGraphicFramePr>
+            <a:graphic>
+              <a:graphicData xmlns:a="http://schemas.openxmlformats.org/drawingml/2006/main" uri="http://schemas.openxmlformats.org/drawingml/2006/picture">
+                <pic:pic xmlns:pic="http://schemas.openxmlformats.org/drawingml/2006/picture">
+                  <pic:nvPicPr>
+                    <pic:cNvPr id="1923999631" name="Picture 1923999631"/>
+                    <pic:cNvPicPr/>
+                  </pic:nvPicPr>
+                  <pic:blipFill>
+                    <a:blip xmlns:r="http://schemas.openxmlformats.org/officeDocument/2006/relationships" r:embed="rId839065539">
+                      <a:extLst>
+                        <a:ext uri="{28A0092B-C50C-407E-A947-70E740481C1C}">
+                          <a14:useLocalDpi xmlns:a14="http://schemas.microsoft.com/office/drawing/2010/main"/>
+                        </a:ext>
+                      </a:extLst>
+                    </a:blip>
+                    <a:stretch>
+                      <a:fillRect/>
+                    </a:stretch>
+                  </pic:blipFill>
+                  <pic:spPr>
+                    <a:xfrm rot="0">
+                      <a:off x="0" y="0"/>
+                      <a:ext cx="5734050" cy="3181350"/>
+                    </a:xfrm>
+                    <a:prstGeom prst="rect">
+                      <a:avLst/>
+                    </a:prstGeom>
+                  </pic:spPr>
+                </pic:pic>
+              </a:graphicData>
+            </a:graphic>
+          </wp:inline>
+        </w:drawing>
+      </w:r>
+    </w:p>
+    <w:p>
+      <w:pPr>
+        <w:pStyle w:val="Normal"/>
+        <w:jc w:val="left"/>
+        <w:rPr>
+          <w:sz w:val="52"/>
+          <w:szCs w:val="52"/>
+        </w:rPr>
+      </w:pPr>
+    </w:p>
+    <w:p>
+      <w:pPr>
+        <w:pStyle w:val="Normal"/>
+        <w:jc w:val="left"/>
+        <w:rPr>
+          <w:rFonts w:ascii="Bookman Old Style" w:hAnsi="Bookman Old Style" w:eastAsia="Bookman Old Style" w:cs="Bookman Old Style"/>
+          <w:sz w:val="52"/>
+          <w:szCs w:val="52"/>
+        </w:rPr>
+      </w:pPr>
+      <w:r>
+        <w:rPr>
+          <w:rFonts w:ascii="Bookman Old Style" w:hAnsi="Bookman Old Style" w:eastAsia="Bookman Old Style" w:cs="Bookman Old Style"/>
+          <w:sz w:val="52"/>
+          <w:szCs w:val="52"/>
+        </w:rPr>
+        <w:t>Zakończenie prac nad projektem: 02.09.2026r.</w:t>
+      </w:r>
+    </w:p>
+    <w:p>
+      <w:pPr>
+        <w:pStyle w:val="Normal"/>
+        <w:jc w:val="left"/>
+      </w:pPr>
+    </w:p>
+    <w:p>
+      <w:pPr>
+        <w:pStyle w:val="Normal"/>
+        <w:jc w:val="left"/>
+      </w:pPr>
+      <w:r>
+        <w:rPr>
+          <w:sz w:val="36"/>
+          <w:szCs w:val="36"/>
+        </w:rPr>
+        <w:t xml:space="preserve">Zakończenie projektu gry. Gra funkcjonuje prawidłowo bez </w:t>
+      </w:r>
+      <w:r>
+        <w:rPr>
+          <w:sz w:val="36"/>
+          <w:szCs w:val="36"/>
+        </w:rPr>
+        <w:t>żadnych problemów.</w:t>
+      </w:r>
+      <w:r>
+        <w:rPr>
+          <w:sz w:val="36"/>
+          <w:szCs w:val="36"/>
+        </w:rPr>
+        <w:t xml:space="preserve"> Dodano </w:t>
+      </w:r>
+      <w:r>
+        <w:rPr>
+          <w:sz w:val="36"/>
+          <w:szCs w:val="36"/>
+        </w:rPr>
+        <w:t>system</w:t>
+      </w:r>
+      <w:r>
+        <w:rPr>
+          <w:sz w:val="36"/>
+          <w:szCs w:val="36"/>
+        </w:rPr>
+        <w:t xml:space="preserve"> który </w:t>
+      </w:r>
+      <w:r>
+        <w:rPr>
+          <w:sz w:val="36"/>
+          <w:szCs w:val="36"/>
+        </w:rPr>
+        <w:t>odczytuje</w:t>
+      </w:r>
+      <w:r>
+        <w:rPr>
+          <w:sz w:val="36"/>
+          <w:szCs w:val="36"/>
+        </w:rPr>
+        <w:t xml:space="preserve"> kiedy jest wygrana kółka lub krzyżyka,</w:t>
+      </w:r>
+      <w:r>
+        <w:rPr>
+          <w:sz w:val="36"/>
+          <w:szCs w:val="36"/>
+        </w:rPr>
+        <w:t xml:space="preserve"> lub remis. Dodano także </w:t>
+      </w:r>
+      <w:r>
+        <w:rPr>
+          <w:sz w:val="36"/>
+          <w:szCs w:val="36"/>
+        </w:rPr>
+        <w:t>kod</w:t>
+      </w:r>
+      <w:r>
+        <w:rPr>
+          <w:sz w:val="36"/>
+          <w:szCs w:val="36"/>
+        </w:rPr>
+        <w:t xml:space="preserve"> który, kiedy użytkownik źle wpisze pole, to </w:t>
+      </w:r>
+      <w:r>
+        <w:rPr>
+          <w:sz w:val="36"/>
+          <w:szCs w:val="36"/>
+        </w:rPr>
+        <w:t>wypisuje</w:t>
+      </w:r>
+      <w:r>
+        <w:rPr>
+          <w:sz w:val="36"/>
+          <w:szCs w:val="36"/>
+        </w:rPr>
+        <w:t xml:space="preserve"> </w:t>
+      </w:r>
+      <w:r>
+        <w:rPr>
+          <w:sz w:val="36"/>
+          <w:szCs w:val="36"/>
+        </w:rPr>
+        <w:t xml:space="preserve">że błąd został popełniony, a kiedy się już wpisze pole poprawnie to wtedy komunikat znika. Kiedy dojdzie do wygranej </w:t>
+      </w:r>
+      <w:r>
+        <w:rPr>
+          <w:sz w:val="36"/>
+          <w:szCs w:val="36"/>
+        </w:rPr>
+        <w:t>albo remisu wtedy program wypisuje kto wygrał/że jest remis i się kończy.</w:t>
+      </w:r>
+    </w:p>
+    <w:p>
+      <w:pPr>
+        <w:pStyle w:val="Normal"/>
+      </w:pPr>
+    </w:p>
+    <w:p>
+      <w:pPr>
+        <w:pStyle w:val="Normal"/>
+        <w:jc w:val="left"/>
+      </w:pPr>
+      <w:r>
+        <w:drawing>
+          <wp:inline wp14:editId="347039A0" wp14:anchorId="6CC6FFC0">
+            <wp:extent cx="5724525" cy="3390900"/>
+            <wp:effectExtent l="0" t="0" r="0" b="0"/>
+            <wp:docPr id="1369721126" name="drawing"/>
+            <wp:cNvGraphicFramePr>
+              <a:graphicFrameLocks noChangeAspect="1"/>
+            </wp:cNvGraphicFramePr>
+            <a:graphic>
+              <a:graphicData xmlns:a="http://schemas.openxmlformats.org/drawingml/2006/main" uri="http://schemas.openxmlformats.org/drawingml/2006/picture">
+                <pic:pic xmlns:pic="http://schemas.openxmlformats.org/drawingml/2006/picture">
+                  <pic:nvPicPr>
+                    <pic:cNvPr id="1369721126" name="Picture 1369721126"/>
+                    <pic:cNvPicPr/>
+                  </pic:nvPicPr>
+                  <pic:blipFill>
+                    <a:blip xmlns:r="http://schemas.openxmlformats.org/officeDocument/2006/relationships" r:embed="rId1893392922">
+                      <a:extLst>
+                        <a:ext uri="{28A0092B-C50C-407E-A947-70E740481C1C}">
+                          <a14:useLocalDpi xmlns:a14="http://schemas.microsoft.com/office/drawing/2010/main"/>
+                        </a:ext>
+                      </a:extLst>
+                    </a:blip>
+                    <a:stretch>
+                      <a:fillRect/>
+                    </a:stretch>
+                  </pic:blipFill>
+                  <pic:spPr>
+                    <a:xfrm>
+                      <a:off x="0" y="0"/>
+                      <a:ext cx="5724525" cy="3390900"/>
+                    </a:xfrm>
+                    <a:prstGeom prst="rect">
+                      <a:avLst/>
+                    </a:prstGeom>
+                  </pic:spPr>
+                </pic:pic>
+              </a:graphicData>
+            </a:graphic>
+          </wp:inline>
+        </w:drawing>
+      </w:r>
+    </w:p>
+    <w:p>
+      <w:pPr>
+        <w:pStyle w:val="Normal"/>
+        <w:jc w:val="left"/>
+      </w:pPr>
+      <w:r>
+        <w:drawing>
+          <wp:inline wp14:editId="0B41C477" wp14:anchorId="73E237D5">
+            <wp:extent cx="5724525" cy="3419475"/>
+            <wp:effectExtent l="0" t="0" r="0" b="0"/>
+            <wp:docPr id="1388593770" name="drawing"/>
+            <wp:cNvGraphicFramePr>
+              <a:graphicFrameLocks noChangeAspect="1"/>
+            </wp:cNvGraphicFramePr>
+            <a:graphic>
+              <a:graphicData xmlns:a="http://schemas.openxmlformats.org/drawingml/2006/main" uri="http://schemas.openxmlformats.org/drawingml/2006/picture">
+                <pic:pic xmlns:pic="http://schemas.openxmlformats.org/drawingml/2006/picture">
+                  <pic:nvPicPr>
+                    <pic:cNvPr id="1388593770" name="Picture 1388593770"/>
+                    <pic:cNvPicPr/>
+                  </pic:nvPicPr>
+                  <pic:blipFill>
+                    <a:blip xmlns:r="http://schemas.openxmlformats.org/officeDocument/2006/relationships" r:embed="rId1427441409">
+                      <a:extLst>
+                        <a:ext uri="{28A0092B-C50C-407E-A947-70E740481C1C}">
+                          <a14:useLocalDpi xmlns:a14="http://schemas.microsoft.com/office/drawing/2010/main"/>
+                        </a:ext>
+                      </a:extLst>
+                    </a:blip>
+                    <a:stretch>
+                      <a:fillRect/>
+                    </a:stretch>
+                  </pic:blipFill>
+                  <pic:spPr>
+                    <a:xfrm>
+                      <a:off x="0" y="0"/>
+                      <a:ext cx="5724525" cy="3419475"/>
+                    </a:xfrm>
+                    <a:prstGeom prst="rect">
+                      <a:avLst/>
+                    </a:prstGeom>
+                  </pic:spPr>
+                </pic:pic>
+              </a:graphicData>
+            </a:graphic>
+          </wp:inline>
+        </w:drawing>
       </w:r>
     </w:p>
     <w:sectPr>
@@ -19,9 +1628,151 @@
       <w:pgMar w:top="1440" w:right="1440" w:bottom="1440" w:left="1440" w:header="708" w:footer="708" w:gutter="0"/>
       <w:cols w:space="708"/>
       <w:docGrid w:linePitch="360"/>
+      <w:headerReference w:type="default" r:id="Re2af168a7f5f40ed"/>
+      <w:footerReference w:type="default" r:id="R028daf9fa0804d89"/>
     </w:sectPr>
   </w:body>
 </w:document>
+</file>
+
+<file path=word/footer.xml><?xml version="1.0" encoding="utf-8"?>
+<w:ftr xmlns:w14="http://schemas.microsoft.com/office/word/2010/wordml" xmlns:w="http://schemas.openxmlformats.org/wordprocessingml/2006/main">
+  <w:tbl>
+    <w:tblPr>
+      <w:tblStyle w:val="TableNormal"/>
+      <w:bidiVisual w:val="0"/>
+      <w:tblW w:w="0" w:type="auto"/>
+      <w:tblLook w:val="06A0" w:firstRow="1" w:lastRow="0" w:firstColumn="1" w:lastColumn="0" w:noHBand="1" w:noVBand="1"/>
+    </w:tblPr>
+    <w:tblGrid>
+      <w:gridCol w:w="3005"/>
+      <w:gridCol w:w="3005"/>
+      <w:gridCol w:w="3005"/>
+    </w:tblGrid>
+    <w:tr>
+      <w:trPr>
+        <w:trHeight w:val="300"/>
+      </w:trPr>
+      <w:tc>
+        <w:tcPr>
+          <w:tcW w:w="3005" w:type="dxa"/>
+          <w:tcMar/>
+        </w:tcPr>
+        <w:p>
+          <w:pPr>
+            <w:pStyle w:val="Header"/>
+            <w:bidi w:val="0"/>
+            <w:ind w:left="-115"/>
+            <w:jc w:val="left"/>
+          </w:pPr>
+        </w:p>
+      </w:tc>
+      <w:tc>
+        <w:tcPr>
+          <w:tcW w:w="3005" w:type="dxa"/>
+          <w:tcMar/>
+        </w:tcPr>
+        <w:p>
+          <w:pPr>
+            <w:pStyle w:val="Header"/>
+            <w:bidi w:val="0"/>
+            <w:jc w:val="center"/>
+          </w:pPr>
+        </w:p>
+      </w:tc>
+      <w:tc>
+        <w:tcPr>
+          <w:tcW w:w="3005" w:type="dxa"/>
+          <w:tcMar/>
+        </w:tcPr>
+        <w:p>
+          <w:pPr>
+            <w:pStyle w:val="Header"/>
+            <w:bidi w:val="0"/>
+            <w:ind w:right="-115"/>
+            <w:jc w:val="right"/>
+          </w:pPr>
+        </w:p>
+      </w:tc>
+    </w:tr>
+  </w:tbl>
+  <w:p>
+    <w:pPr>
+      <w:pStyle w:val="Footer"/>
+      <w:bidi w:val="0"/>
+    </w:pPr>
+  </w:p>
+</w:ftr>
+</file>
+
+<file path=word/header.xml><?xml version="1.0" encoding="utf-8"?>
+<w:hdr xmlns:w14="http://schemas.microsoft.com/office/word/2010/wordml" xmlns:w="http://schemas.openxmlformats.org/wordprocessingml/2006/main">
+  <w:tbl>
+    <w:tblPr>
+      <w:tblStyle w:val="TableNormal"/>
+      <w:bidiVisual w:val="0"/>
+      <w:tblW w:w="0" w:type="auto"/>
+      <w:tblLook w:val="06A0" w:firstRow="1" w:lastRow="0" w:firstColumn="1" w:lastColumn="0" w:noHBand="1" w:noVBand="1"/>
+    </w:tblPr>
+    <w:tblGrid>
+      <w:gridCol w:w="3005"/>
+      <w:gridCol w:w="3005"/>
+      <w:gridCol w:w="3005"/>
+    </w:tblGrid>
+    <w:tr>
+      <w:trPr>
+        <w:trHeight w:val="300"/>
+      </w:trPr>
+      <w:tc>
+        <w:tcPr>
+          <w:tcW w:w="3005" w:type="dxa"/>
+          <w:tcMar/>
+        </w:tcPr>
+        <w:p>
+          <w:pPr>
+            <w:pStyle w:val="Header"/>
+            <w:bidi w:val="0"/>
+            <w:ind w:left="-115"/>
+            <w:jc w:val="left"/>
+          </w:pPr>
+        </w:p>
+      </w:tc>
+      <w:tc>
+        <w:tcPr>
+          <w:tcW w:w="3005" w:type="dxa"/>
+          <w:tcMar/>
+        </w:tcPr>
+        <w:p>
+          <w:pPr>
+            <w:pStyle w:val="Header"/>
+            <w:bidi w:val="0"/>
+            <w:jc w:val="center"/>
+          </w:pPr>
+        </w:p>
+      </w:tc>
+      <w:tc>
+        <w:tcPr>
+          <w:tcW w:w="3005" w:type="dxa"/>
+          <w:tcMar/>
+        </w:tcPr>
+        <w:p>
+          <w:pPr>
+            <w:pStyle w:val="Header"/>
+            <w:bidi w:val="0"/>
+            <w:ind w:right="-115"/>
+            <w:jc w:val="right"/>
+          </w:pPr>
+        </w:p>
+      </w:tc>
+    </w:tr>
+  </w:tbl>
+  <w:p>
+    <w:pPr>
+      <w:pStyle w:val="Header"/>
+      <w:bidi w:val="0"/>
+    </w:pPr>
+  </w:p>
+</w:hdr>
 </file>
 
 <file path=word/styles.xml><?xml version="1.0" encoding="utf-8"?>
@@ -445,6 +2196,71 @@
     <w:semiHidden/>
     <w:unhideWhenUsed/>
   </w:style>
+  <w:style w:type="character" w:styleId="Hyperlink">
+    <w:uiPriority w:val="99"/>
+    <w:name w:val="Hyperlink"/>
+    <w:basedOn w:val="DefaultParagraphFont"/>
+    <w:unhideWhenUsed/>
+    <w:rsid w:val="15007D49"/>
+    <w:rPr>
+      <w:color w:val="467886"/>
+      <w:u w:val="single"/>
+    </w:rPr>
+  </w:style>
+  <w:style w:type="paragraph" w:styleId="Header">
+    <w:uiPriority w:val="99"/>
+    <w:name w:val="header"/>
+    <w:basedOn w:val="Normal"/>
+    <w:unhideWhenUsed/>
+    <w:rsid w:val="15007D49"/>
+    <w:pPr>
+      <w:tabs>
+        <w:tab w:val="center" w:leader="none" w:pos="4680"/>
+        <w:tab w:val="right" w:leader="none" w:pos="9360"/>
+      </w:tabs>
+      <w:spacing w:after="0" w:line="240" w:lineRule="auto"/>
+    </w:pPr>
+  </w:style>
+  <w:style w:type="paragraph" w:styleId="Footer">
+    <w:uiPriority w:val="99"/>
+    <w:name w:val="footer"/>
+    <w:basedOn w:val="Normal"/>
+    <w:unhideWhenUsed/>
+    <w:rsid w:val="15007D49"/>
+    <w:pPr>
+      <w:tabs>
+        <w:tab w:val="center" w:leader="none" w:pos="4680"/>
+        <w:tab w:val="right" w:leader="none" w:pos="9360"/>
+      </w:tabs>
+      <w:spacing w:after="0" w:line="240" w:lineRule="auto"/>
+    </w:pPr>
+  </w:style>
+  <w:style xmlns:w="http://schemas.openxmlformats.org/wordprocessingml/2006/main" w:type="table" w:styleId="TableGrid">
+    <w:name xmlns:w="http://schemas.openxmlformats.org/wordprocessingml/2006/main" w:val="Table Grid"/>
+    <w:basedOn xmlns:w="http://schemas.openxmlformats.org/wordprocessingml/2006/main" w:val="TableNormal"/>
+    <w:uiPriority xmlns:w="http://schemas.openxmlformats.org/wordprocessingml/2006/main" w:val="59"/>
+    <w:rsid xmlns:w="http://schemas.openxmlformats.org/wordprocessingml/2006/main" w:val="00FB4123"/>
+    <w:pPr xmlns:w="http://schemas.openxmlformats.org/wordprocessingml/2006/main">
+      <w:spacing w:after="0" w:line="240" w:lineRule="auto"/>
+    </w:pPr>
+    <w:tblPr xmlns:w="http://schemas.openxmlformats.org/wordprocessingml/2006/main">
+      <w:tblInd w:w="0" w:type="dxa"/>
+      <w:tblBorders>
+        <w:top w:val="single" w:color="000000" w:themeColor="text1" w:sz="4" w:space="0"/>
+        <w:left w:val="single" w:color="000000" w:themeColor="text1" w:sz="4" w:space="0"/>
+        <w:bottom w:val="single" w:color="000000" w:themeColor="text1" w:sz="4" w:space="0"/>
+        <w:right w:val="single" w:color="000000" w:themeColor="text1" w:sz="4" w:space="0"/>
+        <w:insideH w:val="single" w:color="000000" w:themeColor="text1" w:sz="4" w:space="0"/>
+        <w:insideV w:val="single" w:color="000000" w:themeColor="text1" w:sz="4" w:space="0"/>
+      </w:tblBorders>
+      <w:tblCellMar>
+        <w:top w:w="0" w:type="dxa"/>
+        <w:left w:w="108" w:type="dxa"/>
+        <w:bottom w:w="0" w:type="dxa"/>
+        <w:right w:w="108" w:type="dxa"/>
+      </w:tblCellMar>
+    </w:tblPr>
+  </w:style>
 </w:styles>
 </file>
 

</xml_diff>